<commit_message>
Final Module 1.2 assignment with screenshots
</commit_message>
<xml_diff>
--- a/module-1/Jacobo-Assignment1_2.docx
+++ b/module-1/Jacobo-Assignment1_2.docx
@@ -45,10 +45,10 @@
           <w:noProof/>
         </w:rPr>
         <w:drawing>
-          <wp:inline distT="0" distB="0" distL="0" distR="0" wp14:anchorId="65425BF7" wp14:editId="49FFBD2E">
-            <wp:extent cx="5943600" cy="3091180"/>
+          <wp:inline distT="0" distB="0" distL="0" distR="0" wp14:anchorId="71ADB920" wp14:editId="0973E502">
+            <wp:extent cx="5943600" cy="4388485"/>
             <wp:effectExtent l="0" t="0" r="0" b="0"/>
-            <wp:docPr id="45349438" name="Picture 1"/>
+            <wp:docPr id="1561359590" name="Picture 1"/>
             <wp:cNvGraphicFramePr>
               <a:graphicFrameLocks xmlns:a="http://schemas.openxmlformats.org/drawingml/2006/main" noChangeAspect="1"/>
             </wp:cNvGraphicFramePr>
@@ -56,17 +56,11 @@
               <a:graphicData uri="http://schemas.openxmlformats.org/drawingml/2006/picture">
                 <pic:pic xmlns:pic="http://schemas.openxmlformats.org/drawingml/2006/picture">
                   <pic:nvPicPr>
-                    <pic:cNvPr id="45349438" name="Picture 45349438"/>
+                    <pic:cNvPr id="1561359590" name=""/>
                     <pic:cNvPicPr/>
                   </pic:nvPicPr>
                   <pic:blipFill>
-                    <a:blip r:embed="rId4" cstate="print">
-                      <a:extLst>
-                        <a:ext uri="{28A0092B-C50C-407E-A947-70E740481C1C}">
-                          <a14:useLocalDpi xmlns:a14="http://schemas.microsoft.com/office/drawing/2010/main" val="0"/>
-                        </a:ext>
-                      </a:extLst>
-                    </a:blip>
+                    <a:blip r:embed="rId4"/>
                     <a:stretch>
                       <a:fillRect/>
                     </a:stretch>
@@ -74,7 +68,47 @@
                   <pic:spPr>
                     <a:xfrm>
                       <a:off x="0" y="0"/>
-                      <a:ext cx="5943600" cy="3091180"/>
+                      <a:ext cx="5943600" cy="4388485"/>
+                    </a:xfrm>
+                    <a:prstGeom prst="rect">
+                      <a:avLst/>
+                    </a:prstGeom>
+                  </pic:spPr>
+                </pic:pic>
+              </a:graphicData>
+            </a:graphic>
+          </wp:inline>
+        </w:drawing>
+      </w:r>
+    </w:p>
+    <w:p>
+      <w:r>
+        <w:lastRenderedPageBreak/>
+        <w:drawing>
+          <wp:inline distT="0" distB="0" distL="0" distR="0" wp14:anchorId="13343396" wp14:editId="76FDA50C">
+            <wp:extent cx="5943600" cy="1901825"/>
+            <wp:effectExtent l="0" t="0" r="0" b="3175"/>
+            <wp:docPr id="2130097587" name="Picture 1"/>
+            <wp:cNvGraphicFramePr>
+              <a:graphicFrameLocks xmlns:a="http://schemas.openxmlformats.org/drawingml/2006/main" noChangeAspect="1"/>
+            </wp:cNvGraphicFramePr>
+            <a:graphic xmlns:a="http://schemas.openxmlformats.org/drawingml/2006/main">
+              <a:graphicData uri="http://schemas.openxmlformats.org/drawingml/2006/picture">
+                <pic:pic xmlns:pic="http://schemas.openxmlformats.org/drawingml/2006/picture">
+                  <pic:nvPicPr>
+                    <pic:cNvPr id="2130097587" name=""/>
+                    <pic:cNvPicPr/>
+                  </pic:nvPicPr>
+                  <pic:blipFill>
+                    <a:blip r:embed="rId5"/>
+                    <a:stretch>
+                      <a:fillRect/>
+                    </a:stretch>
+                  </pic:blipFill>
+                  <pic:spPr>
+                    <a:xfrm>
+                      <a:off x="0" y="0"/>
+                      <a:ext cx="5943600" cy="1901825"/>
                     </a:xfrm>
                     <a:prstGeom prst="rect">
                       <a:avLst/>
@@ -700,6 +734,7 @@
   <w:style w:type="character" w:default="1" w:styleId="DefaultParagraphFont">
     <w:name w:val="Default Paragraph Font"/>
     <w:uiPriority w:val="1"/>
+    <w:semiHidden/>
     <w:unhideWhenUsed/>
   </w:style>
   <w:style w:type="table" w:default="1" w:styleId="TableNormal">

</xml_diff>